<commit_message>
D5 for Table 4 modified to have combinations of ATC IV level instead of single ATC IV level and results based on simulated data updated
</commit_message>
<xml_diff>
--- a/i_test/test_D6_Tabella_4_esenzione_2025/g_output/D6_Table_4_cardiocircolatoria.docx
+++ b/i_test/test_D6_Tabella_4_esenzione_2025/g_output/D6_Table_4_cardiocircolatoria.docx
@@ -79,37 +79,37 @@
               <w:pStyle w:val="Normal"/>
             </w:pPr>
             <w:r>
-              <w:t>3136</w:t>
-            </w:r>
-          </w:p>
-        </w:tc>
-        <w:tc>
-          <w:p>
-            <w:pPr>
-              <w:pStyle w:val="Normal"/>
-            </w:pPr>
-            <w:r>
-              <w:t>1041</w:t>
-            </w:r>
-          </w:p>
-        </w:tc>
-        <w:tc>
-          <w:p>
-            <w:pPr>
-              <w:pStyle w:val="Normal"/>
-            </w:pPr>
-            <w:r>
-              <w:t>1067</w:t>
-            </w:r>
-          </w:p>
-        </w:tc>
-        <w:tc>
-          <w:p>
-            <w:pPr>
-              <w:pStyle w:val="Normal"/>
-            </w:pPr>
-            <w:r>
-              <w:t>1028</w:t>
+              <w:t>2439</w:t>
+            </w:r>
+          </w:p>
+        </w:tc>
+        <w:tc>
+          <w:p>
+            <w:pPr>
+              <w:pStyle w:val="Normal"/>
+            </w:pPr>
+            <w:r>
+              <w:t>815</w:t>
+            </w:r>
+          </w:p>
+        </w:tc>
+        <w:tc>
+          <w:p>
+            <w:pPr>
+              <w:pStyle w:val="Normal"/>
+            </w:pPr>
+            <w:r>
+              <w:t>796</w:t>
+            </w:r>
+          </w:p>
+        </w:tc>
+        <w:tc>
+          <w:p>
+            <w:pPr>
+              <w:pStyle w:val="Normal"/>
+            </w:pPr>
+            <w:r>
+              <w:t>828</w:t>
             </w:r>
           </w:p>
         </w:tc>
@@ -131,37 +131,37 @@
               <w:pStyle w:val="Normal"/>
             </w:pPr>
             <w:r>
-              <w:t>1.569 (50,0%)</w:t>
-            </w:r>
-          </w:p>
-        </w:tc>
-        <w:tc>
-          <w:p>
-            <w:pPr>
-              <w:pStyle w:val="Normal"/>
-            </w:pPr>
-            <w:r>
-              <w:t>505 (48,5%)</w:t>
-            </w:r>
-          </w:p>
-        </w:tc>
-        <w:tc>
-          <w:p>
-            <w:pPr>
-              <w:pStyle w:val="Normal"/>
-            </w:pPr>
-            <w:r>
-              <w:t>540 (50,6%)</w:t>
-            </w:r>
-          </w:p>
-        </w:tc>
-        <w:tc>
-          <w:p>
-            <w:pPr>
-              <w:pStyle w:val="Normal"/>
-            </w:pPr>
-            <w:r>
-              <w:t>524 (51,0%)</w:t>
+              <w:t>1.211 (49,7%)</w:t>
+            </w:r>
+          </w:p>
+        </w:tc>
+        <w:tc>
+          <w:p>
+            <w:pPr>
+              <w:pStyle w:val="Normal"/>
+            </w:pPr>
+            <w:r>
+              <w:t>397 (48,7%)</w:t>
+            </w:r>
+          </w:p>
+        </w:tc>
+        <w:tc>
+          <w:p>
+            <w:pPr>
+              <w:pStyle w:val="Normal"/>
+            </w:pPr>
+            <w:r>
+              <w:t>402 (50,5%)</w:t>
+            </w:r>
+          </w:p>
+        </w:tc>
+        <w:tc>
+          <w:p>
+            <w:pPr>
+              <w:pStyle w:val="Normal"/>
+            </w:pPr>
+            <w:r>
+              <w:t>412 (49,8%)</w:t>
             </w:r>
           </w:p>
         </w:tc>
@@ -183,37 +183,37 @@
               <w:pStyle w:val="Normal"/>
             </w:pPr>
             <w:r>
-              <w:t>1.063 (33,9%)</w:t>
-            </w:r>
-          </w:p>
-        </w:tc>
-        <w:tc>
-          <w:p>
-            <w:pPr>
-              <w:pStyle w:val="Normal"/>
-            </w:pPr>
-            <w:r>
-              <w:t>367 (35,3%)</w:t>
-            </w:r>
-          </w:p>
-        </w:tc>
-        <w:tc>
-          <w:p>
-            <w:pPr>
-              <w:pStyle w:val="Normal"/>
-            </w:pPr>
-            <w:r>
-              <w:t>357 (33,5%)</w:t>
-            </w:r>
-          </w:p>
-        </w:tc>
-        <w:tc>
-          <w:p>
-            <w:pPr>
-              <w:pStyle w:val="Normal"/>
-            </w:pPr>
-            <w:r>
-              <w:t>339 (33,0%)</w:t>
+              <w:t>843 (34,6%)</w:t>
+            </w:r>
+          </w:p>
+        </w:tc>
+        <w:tc>
+          <w:p>
+            <w:pPr>
+              <w:pStyle w:val="Normal"/>
+            </w:pPr>
+            <w:r>
+              <w:t>292 (35,8%)</w:t>
+            </w:r>
+          </w:p>
+        </w:tc>
+        <w:tc>
+          <w:p>
+            <w:pPr>
+              <w:pStyle w:val="Normal"/>
+            </w:pPr>
+            <w:r>
+              <w:t>282 (35,4%)</w:t>
+            </w:r>
+          </w:p>
+        </w:tc>
+        <w:tc>
+          <w:p>
+            <w:pPr>
+              <w:pStyle w:val="Normal"/>
+            </w:pPr>
+            <w:r>
+              <w:t>269 (32,5%)</w:t>
             </w:r>
           </w:p>
         </w:tc>
@@ -235,37 +235,37 @@
               <w:pStyle w:val="Normal"/>
             </w:pPr>
             <w:r>
-              <w:t>1.050 (33,5%)</w:t>
-            </w:r>
-          </w:p>
-        </w:tc>
-        <w:tc>
-          <w:p>
-            <w:pPr>
-              <w:pStyle w:val="Normal"/>
-            </w:pPr>
-            <w:r>
-              <w:t>328 (31,5%)</w:t>
-            </w:r>
-          </w:p>
-        </w:tc>
-        <w:tc>
-          <w:p>
-            <w:pPr>
-              <w:pStyle w:val="Normal"/>
-            </w:pPr>
-            <w:r>
-              <w:t>371 (34,8%)</w:t>
-            </w:r>
-          </w:p>
-        </w:tc>
-        <w:tc>
-          <w:p>
-            <w:pPr>
-              <w:pStyle w:val="Normal"/>
-            </w:pPr>
-            <w:r>
-              <w:t>351 (34,1%)</w:t>
+              <w:t>811 (33,3%)</w:t>
+            </w:r>
+          </w:p>
+        </w:tc>
+        <w:tc>
+          <w:p>
+            <w:pPr>
+              <w:pStyle w:val="Normal"/>
+            </w:pPr>
+            <w:r>
+              <w:t>257 (31,5%)</w:t>
+            </w:r>
+          </w:p>
+        </w:tc>
+        <w:tc>
+          <w:p>
+            <w:pPr>
+              <w:pStyle w:val="Normal"/>
+            </w:pPr>
+            <w:r>
+              <w:t>265 (33,3%)</w:t>
+            </w:r>
+          </w:p>
+        </w:tc>
+        <w:tc>
+          <w:p>
+            <w:pPr>
+              <w:pStyle w:val="Normal"/>
+            </w:pPr>
+            <w:r>
+              <w:t>289 (34,9%)</w:t>
             </w:r>
           </w:p>
         </w:tc>
@@ -287,37 +287,37 @@
               <w:pStyle w:val="Normal"/>
             </w:pPr>
             <w:r>
-              <w:t>1.023 (32,6%)</w:t>
-            </w:r>
-          </w:p>
-        </w:tc>
-        <w:tc>
-          <w:p>
-            <w:pPr>
-              <w:pStyle w:val="Normal"/>
-            </w:pPr>
-            <w:r>
-              <w:t>346 (33,2%)</w:t>
-            </w:r>
-          </w:p>
-        </w:tc>
-        <w:tc>
-          <w:p>
-            <w:pPr>
-              <w:pStyle w:val="Normal"/>
-            </w:pPr>
-            <w:r>
-              <w:t>339 (31,8%)</w:t>
-            </w:r>
-          </w:p>
-        </w:tc>
-        <w:tc>
-          <w:p>
-            <w:pPr>
-              <w:pStyle w:val="Normal"/>
-            </w:pPr>
-            <w:r>
-              <w:t>338 (32,9%)</w:t>
+              <w:t>785 (32,2%)</w:t>
+            </w:r>
+          </w:p>
+        </w:tc>
+        <w:tc>
+          <w:p>
+            <w:pPr>
+              <w:pStyle w:val="Normal"/>
+            </w:pPr>
+            <w:r>
+              <w:t>266 (32,6%)</w:t>
+            </w:r>
+          </w:p>
+        </w:tc>
+        <w:tc>
+          <w:p>
+            <w:pPr>
+              <w:pStyle w:val="Normal"/>
+            </w:pPr>
+            <w:r>
+              <w:t>249 (31,3%)</w:t>
+            </w:r>
+          </w:p>
+        </w:tc>
+        <w:tc>
+          <w:p>
+            <w:pPr>
+              <w:pStyle w:val="Normal"/>
+            </w:pPr>
+            <w:r>
+              <w:t>270 (32,6%)</w:t>
             </w:r>
           </w:p>
         </w:tc>
@@ -339,37 +339,37 @@
               <w:pStyle w:val="Normal"/>
             </w:pPr>
             <w:r>
-              <w:t>251 (8,0%)</w:t>
-            </w:r>
-          </w:p>
-        </w:tc>
-        <w:tc>
-          <w:p>
-            <w:pPr>
-              <w:pStyle w:val="Normal"/>
-            </w:pPr>
-            <w:r>
-              <w:t>84 (8,1%)</w:t>
-            </w:r>
-          </w:p>
-        </w:tc>
-        <w:tc>
-          <w:p>
-            <w:pPr>
-              <w:pStyle w:val="Normal"/>
-            </w:pPr>
-            <w:r>
-              <w:t>83 (7,8%)</w:t>
-            </w:r>
-          </w:p>
-        </w:tc>
-        <w:tc>
-          <w:p>
-            <w:pPr>
-              <w:pStyle w:val="Normal"/>
-            </w:pPr>
-            <w:r>
-              <w:t>84 (8,2%)</w:t>
+              <w:t>1.614 (66,2%)</w:t>
+            </w:r>
+          </w:p>
+        </w:tc>
+        <w:tc>
+          <w:p>
+            <w:pPr>
+              <w:pStyle w:val="Normal"/>
+            </w:pPr>
+            <w:r>
+              <w:t>544 (66,7%)</w:t>
+            </w:r>
+          </w:p>
+        </w:tc>
+        <w:tc>
+          <w:p>
+            <w:pPr>
+              <w:pStyle w:val="Normal"/>
+            </w:pPr>
+            <w:r>
+              <w:t>536 (67,3%)</w:t>
+            </w:r>
+          </w:p>
+        </w:tc>
+        <w:tc>
+          <w:p>
+            <w:pPr>
+              <w:pStyle w:val="Normal"/>
+            </w:pPr>
+            <w:r>
+              <w:t>534 (64,5%)</w:t>
             </w:r>
           </w:p>
         </w:tc>
@@ -443,37 +443,37 @@
               <w:pStyle w:val="Normal"/>
             </w:pPr>
             <w:r>
-              <w:t>A10BD07 1.144 (36,5%)</w:t>
-            </w:r>
-          </w:p>
-        </w:tc>
-        <w:tc>
-          <w:p>
-            <w:pPr>
-              <w:pStyle w:val="Normal"/>
-            </w:pPr>
-            <w:r>
-              <w:t>A10BD07 400 (38,4%)</w:t>
-            </w:r>
-          </w:p>
-        </w:tc>
-        <w:tc>
-          <w:p>
-            <w:pPr>
-              <w:pStyle w:val="Normal"/>
-            </w:pPr>
-            <w:r>
-              <w:t>A10AE56 394 (36,9%)</w:t>
-            </w:r>
-          </w:p>
-        </w:tc>
-        <w:tc>
-          <w:p>
-            <w:pPr>
-              <w:pStyle w:val="Normal"/>
-            </w:pPr>
-            <w:r>
-              <w:t>A10BD09 393 (38,2%)</w:t>
+              <w:t>B10AE54 176 (7,2%)</w:t>
+            </w:r>
+          </w:p>
+        </w:tc>
+        <w:tc>
+          <w:p>
+            <w:pPr>
+              <w:pStyle w:val="Normal"/>
+            </w:pPr>
+            <w:r>
+              <w:t>A10BD09 65 (8,0%)</w:t>
+            </w:r>
+          </w:p>
+        </w:tc>
+        <w:tc>
+          <w:p>
+            <w:pPr>
+              <w:pStyle w:val="Normal"/>
+            </w:pPr>
+            <w:r>
+              <w:t>D10BK02 59 (7,4%)</w:t>
+            </w:r>
+          </w:p>
+        </w:tc>
+        <w:tc>
+          <w:p>
+            <w:pPr>
+              <w:pStyle w:val="Normal"/>
+            </w:pPr>
+            <w:r>
+              <w:t>B10AE54 66 (8,0%)</w:t>
             </w:r>
           </w:p>
         </w:tc>
@@ -495,37 +495,37 @@
               <w:pStyle w:val="Normal"/>
             </w:pPr>
             <w:r>
-              <w:t>A10BH 1.131 (36,1%)</w:t>
-            </w:r>
-          </w:p>
-        </w:tc>
-        <w:tc>
-          <w:p>
-            <w:pPr>
-              <w:pStyle w:val="Normal"/>
-            </w:pPr>
-            <w:r>
-              <w:t>A10BH 388 (37,3%)</w:t>
-            </w:r>
-          </w:p>
-        </w:tc>
-        <w:tc>
-          <w:p>
-            <w:pPr>
-              <w:pStyle w:val="Normal"/>
-            </w:pPr>
-            <w:r>
-              <w:t>A10BK 390 (36,6%)</w:t>
-            </w:r>
-          </w:p>
-        </w:tc>
-        <w:tc>
-          <w:p>
-            <w:pPr>
-              <w:pStyle w:val="Normal"/>
-            </w:pPr>
-            <w:r>
-              <w:t>A10BH 389 (37,8%)</w:t>
+              <w:t>A10BD09 167 (6,8%)</w:t>
+            </w:r>
+          </w:p>
+        </w:tc>
+        <w:tc>
+          <w:p>
+            <w:pPr>
+              <w:pStyle w:val="Normal"/>
+            </w:pPr>
+            <w:r>
+              <w:t>A10BD07 62 (7,6%)</w:t>
+            </w:r>
+          </w:p>
+        </w:tc>
+        <w:tc>
+          <w:p>
+            <w:pPr>
+              <w:pStyle w:val="Normal"/>
+            </w:pPr>
+            <w:r>
+              <w:t>J10BD16 58 (7,3%)</w:t>
+            </w:r>
+          </w:p>
+        </w:tc>
+        <w:tc>
+          <w:p>
+            <w:pPr>
+              <w:pStyle w:val="Normal"/>
+            </w:pPr>
+            <w:r>
+              <w:t>M10BX16 66 (8,0%)</w:t>
             </w:r>
           </w:p>
         </w:tc>
@@ -547,37 +547,37 @@
               <w:pStyle w:val="Normal"/>
             </w:pPr>
             <w:r>
-              <w:t>A10BD16 1.101 (35,1%)</w:t>
-            </w:r>
-          </w:p>
-        </w:tc>
-        <w:tc>
-          <w:p>
-            <w:pPr>
-              <w:pStyle w:val="Normal"/>
-            </w:pPr>
-            <w:r>
-              <w:t>A10BD08 371 (35,6%)</w:t>
-            </w:r>
-          </w:p>
-        </w:tc>
-        <w:tc>
-          <w:p>
-            <w:pPr>
-              <w:pStyle w:val="Normal"/>
-            </w:pPr>
-            <w:r>
-              <w:t>A10BD15 387 (36,3%)</w:t>
-            </w:r>
-          </w:p>
-        </w:tc>
-        <w:tc>
-          <w:p>
-            <w:pPr>
-              <w:pStyle w:val="Normal"/>
-            </w:pPr>
-            <w:r>
-              <w:t>A10BD13 373 (36,3%)</w:t>
+              <w:t>M10BD10 166 (6,8%)</w:t>
+            </w:r>
+          </w:p>
+        </w:tc>
+        <w:tc>
+          <w:p>
+            <w:pPr>
+              <w:pStyle w:val="Normal"/>
+            </w:pPr>
+            <w:r>
+              <w:t>J10BD23 61 (7,5%)</w:t>
+            </w:r>
+          </w:p>
+        </w:tc>
+        <w:tc>
+          <w:p>
+            <w:pPr>
+              <w:pStyle w:val="Normal"/>
+            </w:pPr>
+            <w:r>
+              <w:t>A10BD11 57 (7,2%)</w:t>
+            </w:r>
+          </w:p>
+        </w:tc>
+        <w:tc>
+          <w:p>
+            <w:pPr>
+              <w:pStyle w:val="Normal"/>
+            </w:pPr>
+            <w:r>
+              <w:t>M10BD16 63 (7,6%)</w:t>
             </w:r>
           </w:p>
         </w:tc>
@@ -599,37 +599,37 @@
               <w:pStyle w:val="Normal"/>
             </w:pPr>
             <w:r>
-              <w:t>A10AE56 1.097 (35,0%)</w:t>
-            </w:r>
-          </w:p>
-        </w:tc>
-        <w:tc>
-          <w:p>
-            <w:pPr>
-              <w:pStyle w:val="Normal"/>
-            </w:pPr>
-            <w:r>
-              <w:t>A10BD21 370 (35,5%)</w:t>
-            </w:r>
-          </w:p>
-        </w:tc>
-        <w:tc>
-          <w:p>
-            <w:pPr>
-              <w:pStyle w:val="Normal"/>
-            </w:pPr>
-            <w:r>
-              <w:t>A10BD07 385 (36,1%)</w:t>
-            </w:r>
-          </w:p>
-        </w:tc>
-        <w:tc>
-          <w:p>
-            <w:pPr>
-              <w:pStyle w:val="Normal"/>
-            </w:pPr>
-            <w:r>
-              <w:t>A10BD16 372 (36,2%)</w:t>
+              <w:t>J10JE54 162 (6,6%)</w:t>
+            </w:r>
+          </w:p>
+        </w:tc>
+        <w:tc>
+          <w:p>
+            <w:pPr>
+              <w:pStyle w:val="Normal"/>
+            </w:pPr>
+            <w:r>
+              <w:t>J10JE54 59 (7,2%)</w:t>
+            </w:r>
+          </w:p>
+        </w:tc>
+        <w:tc>
+          <w:p>
+            <w:pPr>
+              <w:pStyle w:val="Normal"/>
+            </w:pPr>
+            <w:r>
+              <w:t>C10BD21 56 (7,0%)</w:t>
+            </w:r>
+          </w:p>
+        </w:tc>
+        <w:tc>
+          <w:p>
+            <w:pPr>
+              <w:pStyle w:val="Normal"/>
+            </w:pPr>
+            <w:r>
+              <w:t>B10BD21 63 (7,6%)</w:t>
             </w:r>
           </w:p>
         </w:tc>
@@ -651,37 +651,37 @@
               <w:pStyle w:val="Normal"/>
             </w:pPr>
             <w:r>
-              <w:t>A10BD09 1.096 (34,9%)</w:t>
-            </w:r>
-          </w:p>
-        </w:tc>
-        <w:tc>
-          <w:p>
-            <w:pPr>
-              <w:pStyle w:val="Normal"/>
-            </w:pPr>
-            <w:r>
-              <w:t>A10BD16 370 (35,5%)</w:t>
-            </w:r>
-          </w:p>
-        </w:tc>
-        <w:tc>
-          <w:p>
-            <w:pPr>
-              <w:pStyle w:val="Normal"/>
-            </w:pPr>
-            <w:r>
-              <w:t>A10BD11 385 (36,1%)</w:t>
-            </w:r>
-          </w:p>
-        </w:tc>
-        <w:tc>
-          <w:p>
-            <w:pPr>
-              <w:pStyle w:val="Normal"/>
-            </w:pPr>
-            <w:r>
-              <w:t>A10BD20 368 (35,8%)</w:t>
+              <w:t>M10BD16 161 (6,6%)</w:t>
+            </w:r>
+          </w:p>
+        </w:tc>
+        <w:tc>
+          <w:p>
+            <w:pPr>
+              <w:pStyle w:val="Normal"/>
+            </w:pPr>
+            <w:r>
+              <w:t>A10BD16 59 (7,2%)</w:t>
+            </w:r>
+          </w:p>
+        </w:tc>
+        <w:tc>
+          <w:p>
+            <w:pPr>
+              <w:pStyle w:val="Normal"/>
+            </w:pPr>
+            <w:r>
+              <w:t>C10BD08 55 (6,9%)</w:t>
+            </w:r>
+          </w:p>
+        </w:tc>
+        <w:tc>
+          <w:p>
+            <w:pPr>
+              <w:pStyle w:val="Normal"/>
+            </w:pPr>
+            <w:r>
+              <w:t>A10BH02 61 (7,4%)</w:t>
             </w:r>
           </w:p>
         </w:tc>
@@ -755,37 +755,37 @@
               <w:pStyle w:val="Normal"/>
             </w:pPr>
             <w:r>
-              <w:t>A10BD 3.116 (99,4%)</w:t>
-            </w:r>
-          </w:p>
-        </w:tc>
-        <w:tc>
-          <w:p>
-            <w:pPr>
-              <w:pStyle w:val="Normal"/>
-            </w:pPr>
-            <w:r>
-              <w:t>A10BD 1.032 (99,1%)</w:t>
-            </w:r>
-          </w:p>
-        </w:tc>
-        <w:tc>
-          <w:p>
-            <w:pPr>
-              <w:pStyle w:val="Normal"/>
-            </w:pPr>
-            <w:r>
-              <w:t>A10BD 1.064 (99,7%)</w:t>
-            </w:r>
-          </w:p>
-        </w:tc>
-        <w:tc>
-          <w:p>
-            <w:pPr>
-              <w:pStyle w:val="Normal"/>
-            </w:pPr>
-            <w:r>
-              <w:t>A10BD 1.020 (99,2%)</w:t>
+              <w:t>A10BD B10BD C10BD J10BD M10BD 12 (0,5%)</w:t>
+            </w:r>
+          </w:p>
+        </w:tc>
+        <w:tc>
+          <w:p>
+            <w:pPr>
+              <w:pStyle w:val="Normal"/>
+            </w:pPr>
+            <w:r>
+              <w:t>A10BD B10BD C10BD J10BD M10BD 5 (0,6%)</w:t>
+            </w:r>
+          </w:p>
+        </w:tc>
+        <w:tc>
+          <w:p>
+            <w:pPr>
+              <w:pStyle w:val="Normal"/>
+            </w:pPr>
+            <w:r>
+              <w:t>A10BD B10BD C10BD D10BD J10BD 5 (0,6%)</w:t>
+            </w:r>
+          </w:p>
+        </w:tc>
+        <w:tc>
+          <w:p>
+            <w:pPr>
+              <w:pStyle w:val="Normal"/>
+            </w:pPr>
+            <w:r>
+              <w:t>A10BD B10BD C10BD J10BD M10BD 5 (0,6%)</w:t>
             </w:r>
           </w:p>
         </w:tc>
@@ -807,37 +807,37 @@
               <w:pStyle w:val="Normal"/>
             </w:pPr>
             <w:r>
-              <w:t>A10AE 1.577 (50,3%)</w:t>
-            </w:r>
-          </w:p>
-        </w:tc>
-        <w:tc>
-          <w:p>
-            <w:pPr>
-              <w:pStyle w:val="Normal"/>
-            </w:pPr>
-            <w:r>
-              <w:t>A10AE 529 (50,8%)</w:t>
-            </w:r>
-          </w:p>
-        </w:tc>
-        <w:tc>
-          <w:p>
-            <w:pPr>
-              <w:pStyle w:val="Normal"/>
-            </w:pPr>
-            <w:r>
-              <w:t>A10AE 541 (50,7%)</w:t>
-            </w:r>
-          </w:p>
-        </w:tc>
-        <w:tc>
-          <w:p>
-            <w:pPr>
-              <w:pStyle w:val="Normal"/>
-            </w:pPr>
-            <w:r>
-              <w:t>A10AE 507 (49,3%)</w:t>
+              <w:t>A10BD B10BD C10BD D10BD J10BD M10BD 10 (0,4%)</w:t>
+            </w:r>
+          </w:p>
+        </w:tc>
+        <w:tc>
+          <w:p>
+            <w:pPr>
+              <w:pStyle w:val="Normal"/>
+            </w:pPr>
+            <w:r>
+              <w:t>A10BD B10BD C10BD D10BD J10BD M10BD 4 (0,5%)</w:t>
+            </w:r>
+          </w:p>
+        </w:tc>
+        <w:tc>
+          <w:p>
+            <w:pPr>
+              <w:pStyle w:val="Normal"/>
+            </w:pPr>
+            <w:r>
+              <w:t>A10BD B10BD C10BD D10BD J10BD M10BD 3 (0,4%)</w:t>
+            </w:r>
+          </w:p>
+        </w:tc>
+        <w:tc>
+          <w:p>
+            <w:pPr>
+              <w:pStyle w:val="Normal"/>
+            </w:pPr>
+            <w:r>
+              <w:t>A10BD B10BD C10BD D10BD J10BD M10BD 3 (0,4%)</w:t>
             </w:r>
           </w:p>
         </w:tc>
@@ -859,37 +859,37 @@
               <w:pStyle w:val="Normal"/>
             </w:pPr>
             <w:r>
-              <w:t>A10BH 946 (30,2%)</w:t>
-            </w:r>
-          </w:p>
-        </w:tc>
-        <w:tc>
-          <w:p>
-            <w:pPr>
-              <w:pStyle w:val="Normal"/>
-            </w:pPr>
-            <w:r>
-              <w:t>A10BH 325 (31,2%)</w:t>
-            </w:r>
-          </w:p>
-        </w:tc>
-        <w:tc>
-          <w:p>
-            <w:pPr>
-              <w:pStyle w:val="Normal"/>
-            </w:pPr>
-            <w:r>
-              <w:t>A10BK 325 (30,5%)</w:t>
-            </w:r>
-          </w:p>
-        </w:tc>
-        <w:tc>
-          <w:p>
-            <w:pPr>
-              <w:pStyle w:val="Normal"/>
-            </w:pPr>
-            <w:r>
-              <w:t>A10BH 325 (31,6%)</w:t>
+              <w:t>A10BD B10BD C10BD D10BD J10BD 9 (0,4%)</w:t>
+            </w:r>
+          </w:p>
+        </w:tc>
+        <w:tc>
+          <w:p>
+            <w:pPr>
+              <w:pStyle w:val="Normal"/>
+            </w:pPr>
+            <w:r>
+              <w:t>A10BD B10BD C10BD D10BD J10BD 3 (0,4%)</w:t>
+            </w:r>
+          </w:p>
+        </w:tc>
+        <w:tc>
+          <w:p>
+            <w:pPr>
+              <w:pStyle w:val="Normal"/>
+            </w:pPr>
+            <w:r>
+              <w:t>B10BD C10BD D10BD J10BD M10BD 3 (0,4%)</w:t>
+            </w:r>
+          </w:p>
+        </w:tc>
+        <w:tc>
+          <w:p>
+            <w:pPr>
+              <w:pStyle w:val="Normal"/>
+            </w:pPr>
+            <w:r>
+              <w:t>B10BJ C10BD D10BD J10BD M10BD 2 (0,2%)</w:t>
             </w:r>
           </w:p>
         </w:tc>
@@ -911,37 +911,37 @@
               <w:pStyle w:val="Normal"/>
             </w:pPr>
             <w:r>
-              <w:t>A10BK 924 (29,5%)</w:t>
-            </w:r>
-          </w:p>
-        </w:tc>
-        <w:tc>
-          <w:p>
-            <w:pPr>
-              <w:pStyle w:val="Normal"/>
-            </w:pPr>
-            <w:r>
-              <w:t>A10BK 299 (28,7%)</w:t>
-            </w:r>
-          </w:p>
-        </w:tc>
-        <w:tc>
-          <w:p>
-            <w:pPr>
-              <w:pStyle w:val="Normal"/>
-            </w:pPr>
-            <w:r>
-              <w:t>A10BJ 312 (29,2%)</w:t>
-            </w:r>
-          </w:p>
-        </w:tc>
-        <w:tc>
-          <w:p>
-            <w:pPr>
-              <w:pStyle w:val="Normal"/>
-            </w:pPr>
-            <w:r>
-              <w:t>A10BK 300 (29,2%)</w:t>
+              <w:t>B10BD C10BD D10BD J10BD M10BD 6 (0,2%)</w:t>
+            </w:r>
+          </w:p>
+        </w:tc>
+        <w:tc>
+          <w:p>
+            <w:pPr>
+              <w:pStyle w:val="Normal"/>
+            </w:pPr>
+            <w:r>
+              <w:t>A10BD B10BD D10BD J10BD M10BD 2 (0,2%)</w:t>
+            </w:r>
+          </w:p>
+        </w:tc>
+        <w:tc>
+          <w:p>
+            <w:pPr>
+              <w:pStyle w:val="Normal"/>
+            </w:pPr>
+            <w:r>
+              <w:t>A10AE B10BD C10BD D10BD J10BD M10BD 2 (0,3%)</w:t>
+            </w:r>
+          </w:p>
+        </w:tc>
+        <w:tc>
+          <w:p>
+            <w:pPr>
+              <w:pStyle w:val="Normal"/>
+            </w:pPr>
+            <w:r>
+              <w:t>B10BD C10BD D10BD J10BD M10BD 2 (0,2%)</w:t>
             </w:r>
           </w:p>
         </w:tc>
@@ -963,37 +963,37 @@
               <w:pStyle w:val="Normal"/>
             </w:pPr>
             <w:r>
-              <w:t>A10BX 892 (28,4%)</w:t>
-            </w:r>
-          </w:p>
-        </w:tc>
-        <w:tc>
-          <w:p>
-            <w:pPr>
-              <w:pStyle w:val="Normal"/>
-            </w:pPr>
-            <w:r>
-              <w:t>A10BX 294 (28,2%)</w:t>
-            </w:r>
-          </w:p>
-        </w:tc>
-        <w:tc>
-          <w:p>
-            <w:pPr>
-              <w:pStyle w:val="Normal"/>
-            </w:pPr>
-            <w:r>
-              <w:t>A10BX 299 (28,0%)</w:t>
-            </w:r>
-          </w:p>
-        </w:tc>
-        <w:tc>
-          <w:p>
-            <w:pPr>
-              <w:pStyle w:val="Normal"/>
-            </w:pPr>
-            <w:r>
-              <w:t>A10BX 299 (29,1%)</w:t>
+              <w:t>A10BD B10BD D10BD J10BD M10BD 4 (0,2%)</w:t>
+            </w:r>
+          </w:p>
+        </w:tc>
+        <w:tc>
+          <w:p>
+            <w:pPr>
+              <w:pStyle w:val="Normal"/>
+            </w:pPr>
+            <w:r>
+              <w:t>A10AE A10BD C10BD D10BD J10BD J10JE M10BD 2 (0,2%)</w:t>
+            </w:r>
+          </w:p>
+        </w:tc>
+        <w:tc>
+          <w:p>
+            <w:pPr>
+              <w:pStyle w:val="Normal"/>
+            </w:pPr>
+            <w:r>
+              <w:t>A10AE A10BD B10BD D10BD M10BD 2 (0,3%)</w:t>
+            </w:r>
+          </w:p>
+        </w:tc>
+        <w:tc>
+          <w:p>
+            <w:pPr>
+              <w:pStyle w:val="Normal"/>
+            </w:pPr>
+            <w:r>
+              <w:t>A10BD B10BD C10BD C10BJ D10BD 2 (0,2%)</w:t>
             </w:r>
           </w:p>
         </w:tc>

</xml_diff>